<commit_message>
feat: Código e relatório para a entrega 3
</commit_message>
<xml_diff>
--- a/atv03/03-Leonardo_Cortes_Filho.docx
+++ b/atv03/03-Leonardo_Cortes_Filho.docx
@@ -86,7 +86,7 @@
           <w:sz w:val="20"/>
           <w:szCs w:val="20"/>
         </w:rPr>
-        <w:t xml:space="preserve">&lt;Nesta seção o participante deverá descrever com suas próprias palavras os temas abordados nas tarefas do card. É importante demonstrar que houve entendimento dos temas, isto mediante evidências com imagens, gráficos e textos originais produzidos por você. Códigos também podem ser referenciados desde que estejam no github ou Notebook entregue junto com o relatório&gt; </w:t>
+        <w:t xml:space="preserve">O vídeo ensina como fazer o uso de Pydantic, principalmente para a validação de dados, mostrando como usar essa biblioteca para criar classes com validação especializada e serialização customizada. </w:t>
       </w:r>
     </w:p>
     <w:p>
@@ -94,12 +94,231 @@
         <w:pStyle w:val="Normal"/>
         <w:rPr>
           <w:rFonts w:ascii="Arial" w:hAnsi="Arial" w:cs="Arial"/>
-        </w:rPr>
-      </w:pPr>
-      <w:r>
-        <w:rPr>
-          <w:rFonts w:cs="Arial" w:ascii="Arial" w:hAnsi="Arial"/>
-        </w:rPr>
+          <w:sz w:val="20"/>
+          <w:szCs w:val="20"/>
+        </w:rPr>
+      </w:pPr>
+      <w:r>
+        <w:rPr>
+          <w:rFonts w:cs="Arial" w:ascii="Arial" w:hAnsi="Arial"/>
+          <w:sz w:val="20"/>
+          <w:szCs w:val="20"/>
+        </w:rPr>
+        <w:t>Fluxo de dados com o</w:t>
+      </w:r>
+      <w:r>
+        <w:rPr>
+          <w:rFonts w:cs="Arial" w:ascii="Arial" w:hAnsi="Arial"/>
+          <w:sz w:val="20"/>
+          <w:szCs w:val="20"/>
+        </w:rPr>
+        <w:t xml:space="preserve"> Pydantic:</w:t>
+      </w:r>
+    </w:p>
+    <w:p>
+      <w:pPr>
+        <w:pStyle w:val="Normal"/>
+        <w:rPr>
+          <w:rFonts w:ascii="Arial" w:hAnsi="Arial" w:cs="Arial"/>
+          <w:sz w:val="20"/>
+          <w:szCs w:val="20"/>
+        </w:rPr>
+      </w:pPr>
+      <w:r>
+        <w:rPr/>
+        <w:drawing>
+          <wp:anchor behindDoc="0" distT="0" distB="0" distL="0" distR="0" simplePos="0" locked="0" layoutInCell="0" allowOverlap="1" relativeHeight="2">
+            <wp:simplePos x="0" y="0"/>
+            <wp:positionH relativeFrom="column">
+              <wp:align>center</wp:align>
+            </wp:positionH>
+            <wp:positionV relativeFrom="paragraph">
+              <wp:posOffset>635</wp:posOffset>
+            </wp:positionV>
+            <wp:extent cx="3057525" cy="1724025"/>
+            <wp:effectExtent l="0" t="0" r="0" b="0"/>
+            <wp:wrapTopAndBottom/>
+            <wp:docPr id="1" name="Image1" descr=""/>
+            <wp:cNvGraphicFramePr>
+              <a:graphicFrameLocks xmlns:a="http://schemas.openxmlformats.org/drawingml/2006/main" noChangeAspect="1"/>
+            </wp:cNvGraphicFramePr>
+            <a:graphic xmlns:a="http://schemas.openxmlformats.org/drawingml/2006/main">
+              <a:graphicData uri="http://schemas.openxmlformats.org/drawingml/2006/picture">
+                <pic:pic xmlns:pic="http://schemas.openxmlformats.org/drawingml/2006/picture">
+                  <pic:nvPicPr>
+                    <pic:cNvPr id="1" name="Image1" descr=""/>
+                    <pic:cNvPicPr>
+                      <a:picLocks noChangeAspect="1" noChangeArrowheads="1"/>
+                    </pic:cNvPicPr>
+                  </pic:nvPicPr>
+                  <pic:blipFill>
+                    <a:blip r:embed="rId2"/>
+                    <a:stretch>
+                      <a:fillRect/>
+                    </a:stretch>
+                  </pic:blipFill>
+                  <pic:spPr bwMode="auto">
+                    <a:xfrm>
+                      <a:off x="0" y="0"/>
+                      <a:ext cx="3057525" cy="1724025"/>
+                    </a:xfrm>
+                    <a:prstGeom prst="rect">
+                      <a:avLst/>
+                    </a:prstGeom>
+                  </pic:spPr>
+                </pic:pic>
+              </a:graphicData>
+            </a:graphic>
+          </wp:anchor>
+        </w:drawing>
+      </w:r>
+    </w:p>
+    <w:p>
+      <w:pPr>
+        <w:pStyle w:val="Normal"/>
+        <w:rPr>
+          <w:rFonts w:ascii="Arial" w:hAnsi="Arial" w:cs="Arial"/>
+          <w:sz w:val="20"/>
+          <w:szCs w:val="20"/>
+        </w:rPr>
+      </w:pPr>
+      <w:r>
+        <w:rPr>
+          <w:rFonts w:cs="Arial" w:ascii="Arial" w:hAnsi="Arial"/>
+          <w:sz w:val="20"/>
+          <w:szCs w:val="20"/>
+        </w:rPr>
+        <w:t>Alguns padrões de programação são demonstrados de maneiras sutis durante o vídeo, a senha DEVE ser secret, vulgo nem o programador pode ler, deve ser criptografada ao ser salva, deve ser forte, letras maiusculas e minusculas, números, etc, e não deve ser salva na serialização das classes. Quanto os usuário foi feito o uso padrão de permissões via int, seguindo potências de 2, com o usuário comum tendo nível 0, vulgo permissão mínima.</w:t>
+      </w:r>
+    </w:p>
+    <w:p>
+      <w:pPr>
+        <w:pStyle w:val="Normal"/>
+        <w:rPr>
+          <w:rFonts w:ascii="Arial" w:hAnsi="Arial" w:cs="Arial"/>
+          <w:sz w:val="20"/>
+          <w:szCs w:val="20"/>
+        </w:rPr>
+      </w:pPr>
+      <w:r>
+        <w:rPr>
+          <w:rFonts w:cs="Arial" w:ascii="Arial" w:hAnsi="Arial"/>
+          <w:sz w:val="20"/>
+          <w:szCs w:val="20"/>
+        </w:rPr>
+        <w:t>A parte de serialização mostra o controle fino que temos para o que é exposto no .json e como, vulgo a ordem dos dados, quais dados são exibidos, como os dados são exibidos (int ou o nome), a ordem dos dados, etc.</w:t>
+      </w:r>
+    </w:p>
+    <w:p>
+      <w:pPr>
+        <w:pStyle w:val="Normal"/>
+        <w:rPr>
+          <w:rFonts w:ascii="Arial" w:hAnsi="Arial" w:cs="Arial"/>
+          <w:sz w:val="20"/>
+          <w:szCs w:val="20"/>
+        </w:rPr>
+      </w:pPr>
+      <w:r>
+        <w:rPr>
+          <w:rFonts w:cs="Arial" w:ascii="Arial" w:hAnsi="Arial"/>
+          <w:sz w:val="20"/>
+          <w:szCs w:val="20"/>
+        </w:rPr>
+        <w:t>A integração com FastAPI exibiu de maneira simples que o pydantic pode facilmente ser integrado em sistemas que usam esse tipo de API para garantir a validação das requisições.</w:t>
+      </w:r>
+    </w:p>
+    <w:p>
+      <w:pPr>
+        <w:pStyle w:val="fastcamp"/>
+        <w:rPr/>
+      </w:pPr>
+      <w:r>
+        <w:rPr/>
+        <w:t xml:space="preserve">No contexto de desenvolvimento com IAs, o uso mais comum de Pydantic aparenta ser garantir uma saída padronizada pelo modelo, de modo que as saídas são validadas pelo Pydantic e, caso um problema seja encontrado, são retornadas para o modelo até a saída desejável </w:t>
+      </w:r>
+      <w:r>
+        <w:rPr/>
+        <w:t>ser</w:t>
+      </w:r>
+      <w:r>
+        <w:rPr/>
+        <w:t xml:space="preserve"> alcançada, garantindo que a output siga o padrão pré-definido. O modelo ‘aprende’ o padrão pela serialização do </w:t>
+      </w:r>
+      <w:r>
+        <w:rPr>
+          <w:rFonts w:cs="Arial" w:ascii="Arial" w:hAnsi="Arial"/>
+          <w:sz w:val="20"/>
+          <w:szCs w:val="20"/>
+        </w:rPr>
+        <w:t>Pydantic</w:t>
+      </w:r>
+      <w:r>
+        <w:rPr/>
+        <w:t xml:space="preserve"> e a biblioteca valida a saída do modelo, retornando erros até a saída estar no padrão desejado.</w:t>
+      </w:r>
+    </w:p>
+    <w:p>
+      <w:pPr>
+        <w:pStyle w:val="fastcamp"/>
+        <w:rPr/>
+      </w:pPr>
+      <w:r>
+        <w:rPr/>
+        <w:t>Sistema com uso de Pydantic:</w:t>
+      </w:r>
+    </w:p>
+    <w:p>
+      <w:pPr>
+        <w:pStyle w:val="fastcamp"/>
+        <w:rPr/>
+      </w:pPr>
+      <w:r>
+        <w:rPr/>
+        <w:drawing>
+          <wp:anchor behindDoc="0" distT="0" distB="0" distL="0" distR="0" simplePos="0" locked="0" layoutInCell="0" allowOverlap="1" relativeHeight="3">
+            <wp:simplePos x="0" y="0"/>
+            <wp:positionH relativeFrom="column">
+              <wp:align>center</wp:align>
+            </wp:positionH>
+            <wp:positionV relativeFrom="paragraph">
+              <wp:posOffset>635</wp:posOffset>
+            </wp:positionV>
+            <wp:extent cx="4152900" cy="2105025"/>
+            <wp:effectExtent l="0" t="0" r="0" b="0"/>
+            <wp:wrapSquare wrapText="largest"/>
+            <wp:docPr id="2" name="Image2" descr=""/>
+            <wp:cNvGraphicFramePr>
+              <a:graphicFrameLocks xmlns:a="http://schemas.openxmlformats.org/drawingml/2006/main" noChangeAspect="1"/>
+            </wp:cNvGraphicFramePr>
+            <a:graphic xmlns:a="http://schemas.openxmlformats.org/drawingml/2006/main">
+              <a:graphicData uri="http://schemas.openxmlformats.org/drawingml/2006/picture">
+                <pic:pic xmlns:pic="http://schemas.openxmlformats.org/drawingml/2006/picture">
+                  <pic:nvPicPr>
+                    <pic:cNvPr id="2" name="Image2" descr=""/>
+                    <pic:cNvPicPr>
+                      <a:picLocks noChangeAspect="1" noChangeArrowheads="1"/>
+                    </pic:cNvPicPr>
+                  </pic:nvPicPr>
+                  <pic:blipFill>
+                    <a:blip r:embed="rId3"/>
+                    <a:stretch>
+                      <a:fillRect/>
+                    </a:stretch>
+                  </pic:blipFill>
+                  <pic:spPr bwMode="auto">
+                    <a:xfrm>
+                      <a:off x="0" y="0"/>
+                      <a:ext cx="4152900" cy="2105025"/>
+                    </a:xfrm>
+                    <a:prstGeom prst="rect">
+                      <a:avLst/>
+                    </a:prstGeom>
+                  </pic:spPr>
+                </pic:pic>
+              </a:graphicData>
+            </a:graphic>
+          </wp:anchor>
+        </w:drawing>
       </w:r>
     </w:p>
     <w:p>
@@ -184,7 +403,7 @@
           <w:sz w:val="20"/>
           <w:szCs w:val="20"/>
         </w:rPr>
-        <w:t>&lt;Nesta seção o participante deverá descrever as suas conclusões sobre os temas abordados nas tarefas do card.&gt;</w:t>
+        <w:t>Pydantic é uma biblioteca muito poderosa para a padronização de dados de projetos, garantindo previsibilidade e funcionamento do sistema de acordo com os padrões decididos no planejamento. Além disso, essa ferramenta é bem integrada com outras ferramentas, permitindo o uso fácil com FastAPI e uso para sistemas com modelos de IA, podendo ser um componente central na validação ou um ótimo gate.</w:t>
       </w:r>
     </w:p>
     <w:p>
@@ -241,33 +460,57 @@
         </w:numPr>
         <w:rPr/>
       </w:pPr>
-      <w:hyperlink r:id="rId3">
+      <w:r>
+        <w:rPr>
+          <w:rStyle w:val="Hyperlink"/>
+        </w:rPr>
+        <w:t>https://www.youtube.com/watch?v=502XOB0u8OY&amp;t=46s</w:t>
+      </w:r>
+    </w:p>
+    <w:p>
+      <w:pPr>
+        <w:pStyle w:val="fastcamp"/>
+        <w:rPr/>
+      </w:pPr>
+      <w:r>
+        <w:rPr/>
+        <w:t>Externas:</w:t>
+      </w:r>
+    </w:p>
+    <w:p>
+      <w:pPr>
+        <w:pStyle w:val="fastcamp"/>
+        <w:numPr>
+          <w:ilvl w:val="0"/>
+          <w:numId w:val="3"/>
+        </w:numPr>
+        <w:spacing w:before="0" w:after="160"/>
+        <w:rPr/>
+      </w:pPr>
+      <w:hyperlink r:id="rId5">
         <w:r>
           <w:rPr>
             <w:rStyle w:val="Hyperlink"/>
           </w:rPr>
-          <w:t>https://www.youtube.com/watch?v=502XOB0u8OY&amp;t=46s</w:t>
+          <w:t>https://docs.pydantic.dev/latest/</w:t>
         </w:r>
       </w:hyperlink>
     </w:p>
     <w:p>
       <w:pPr>
         <w:pStyle w:val="fastcamp"/>
-        <w:rPr/>
-      </w:pPr>
-      <w:r>
-        <w:rPr/>
-        <w:t>Externas:</w:t>
-      </w:r>
-    </w:p>
-    <w:p>
-      <w:pPr>
-        <w:pStyle w:val="fastcamp"/>
+        <w:numPr>
+          <w:ilvl w:val="0"/>
+          <w:numId w:val="3"/>
+        </w:numPr>
         <w:spacing w:before="0" w:after="160"/>
         <w:rPr/>
       </w:pPr>
       <w:r>
-        <w:rPr/>
+        <w:rPr>
+          <w:rStyle w:val="Hyperlink"/>
+        </w:rPr>
+        <w:t>https://realpython.com/pydantic-ai/</w:t>
       </w:r>
     </w:p>
     <w:sectPr>
@@ -541,11 +784,151 @@
       </w:rPr>
     </w:lvl>
   </w:abstractNum>
+  <w:abstractNum w:abstractNumId="3">
+    <w:lvl w:ilvl="0">
+      <w:start w:val="1"/>
+      <w:numFmt w:val="bullet"/>
+      <w:lvlText w:val=""/>
+      <w:lvlJc w:val="left"/>
+      <w:pPr>
+        <w:tabs>
+          <w:tab w:val="num" w:pos="720"/>
+        </w:tabs>
+        <w:ind w:left="720" w:hanging="360"/>
+      </w:pPr>
+      <w:rPr>
+        <w:rFonts w:ascii="Symbol" w:hAnsi="Symbol" w:cs="Symbol" w:hint="default"/>
+      </w:rPr>
+    </w:lvl>
+    <w:lvl w:ilvl="1">
+      <w:start w:val="1"/>
+      <w:numFmt w:val="bullet"/>
+      <w:lvlText w:val="◦"/>
+      <w:lvlJc w:val="left"/>
+      <w:pPr>
+        <w:tabs>
+          <w:tab w:val="num" w:pos="1080"/>
+        </w:tabs>
+        <w:ind w:left="1080" w:hanging="360"/>
+      </w:pPr>
+      <w:rPr>
+        <w:rFonts w:ascii="OpenSymbol" w:hAnsi="OpenSymbol" w:cs="OpenSymbol" w:hint="default"/>
+      </w:rPr>
+    </w:lvl>
+    <w:lvl w:ilvl="2">
+      <w:start w:val="1"/>
+      <w:numFmt w:val="bullet"/>
+      <w:lvlText w:val="▪"/>
+      <w:lvlJc w:val="left"/>
+      <w:pPr>
+        <w:tabs>
+          <w:tab w:val="num" w:pos="1440"/>
+        </w:tabs>
+        <w:ind w:left="1440" w:hanging="360"/>
+      </w:pPr>
+      <w:rPr>
+        <w:rFonts w:ascii="OpenSymbol" w:hAnsi="OpenSymbol" w:cs="OpenSymbol" w:hint="default"/>
+      </w:rPr>
+    </w:lvl>
+    <w:lvl w:ilvl="3">
+      <w:start w:val="1"/>
+      <w:numFmt w:val="bullet"/>
+      <w:lvlText w:val=""/>
+      <w:lvlJc w:val="left"/>
+      <w:pPr>
+        <w:tabs>
+          <w:tab w:val="num" w:pos="1800"/>
+        </w:tabs>
+        <w:ind w:left="1800" w:hanging="360"/>
+      </w:pPr>
+      <w:rPr>
+        <w:rFonts w:ascii="Symbol" w:hAnsi="Symbol" w:cs="Symbol" w:hint="default"/>
+      </w:rPr>
+    </w:lvl>
+    <w:lvl w:ilvl="4">
+      <w:start w:val="1"/>
+      <w:numFmt w:val="bullet"/>
+      <w:lvlText w:val="◦"/>
+      <w:lvlJc w:val="left"/>
+      <w:pPr>
+        <w:tabs>
+          <w:tab w:val="num" w:pos="2160"/>
+        </w:tabs>
+        <w:ind w:left="2160" w:hanging="360"/>
+      </w:pPr>
+      <w:rPr>
+        <w:rFonts w:ascii="OpenSymbol" w:hAnsi="OpenSymbol" w:cs="OpenSymbol" w:hint="default"/>
+      </w:rPr>
+    </w:lvl>
+    <w:lvl w:ilvl="5">
+      <w:start w:val="1"/>
+      <w:numFmt w:val="bullet"/>
+      <w:lvlText w:val="▪"/>
+      <w:lvlJc w:val="left"/>
+      <w:pPr>
+        <w:tabs>
+          <w:tab w:val="num" w:pos="2520"/>
+        </w:tabs>
+        <w:ind w:left="2520" w:hanging="360"/>
+      </w:pPr>
+      <w:rPr>
+        <w:rFonts w:ascii="OpenSymbol" w:hAnsi="OpenSymbol" w:cs="OpenSymbol" w:hint="default"/>
+      </w:rPr>
+    </w:lvl>
+    <w:lvl w:ilvl="6">
+      <w:start w:val="1"/>
+      <w:numFmt w:val="bullet"/>
+      <w:lvlText w:val=""/>
+      <w:lvlJc w:val="left"/>
+      <w:pPr>
+        <w:tabs>
+          <w:tab w:val="num" w:pos="2880"/>
+        </w:tabs>
+        <w:ind w:left="2880" w:hanging="360"/>
+      </w:pPr>
+      <w:rPr>
+        <w:rFonts w:ascii="Symbol" w:hAnsi="Symbol" w:cs="Symbol" w:hint="default"/>
+      </w:rPr>
+    </w:lvl>
+    <w:lvl w:ilvl="7">
+      <w:start w:val="1"/>
+      <w:numFmt w:val="bullet"/>
+      <w:lvlText w:val="◦"/>
+      <w:lvlJc w:val="left"/>
+      <w:pPr>
+        <w:tabs>
+          <w:tab w:val="num" w:pos="3240"/>
+        </w:tabs>
+        <w:ind w:left="3240" w:hanging="360"/>
+      </w:pPr>
+      <w:rPr>
+        <w:rFonts w:ascii="OpenSymbol" w:hAnsi="OpenSymbol" w:cs="OpenSymbol" w:hint="default"/>
+      </w:rPr>
+    </w:lvl>
+    <w:lvl w:ilvl="8">
+      <w:start w:val="1"/>
+      <w:numFmt w:val="bullet"/>
+      <w:lvlText w:val="▪"/>
+      <w:lvlJc w:val="left"/>
+      <w:pPr>
+        <w:tabs>
+          <w:tab w:val="num" w:pos="3600"/>
+        </w:tabs>
+        <w:ind w:left="3600" w:hanging="360"/>
+      </w:pPr>
+      <w:rPr>
+        <w:rFonts w:ascii="OpenSymbol" w:hAnsi="OpenSymbol" w:cs="OpenSymbol" w:hint="default"/>
+      </w:rPr>
+    </w:lvl>
+  </w:abstractNum>
   <w:num w:numId="1">
     <w:abstractNumId w:val="1"/>
   </w:num>
   <w:num w:numId="2">
     <w:abstractNumId w:val="2"/>
+  </w:num>
+  <w:num w:numId="3">
+    <w:abstractNumId w:val="3"/>
   </w:num>
 </w:numbering>
 </file>
@@ -990,6 +1373,28 @@
       <w:u w:val="single"/>
     </w:rPr>
   </w:style>
+  <w:style w:type="character" w:styleId="Strong">
+    <w:name w:val="Strong"/>
+    <w:qFormat/>
+    <w:rPr>
+      <w:b/>
+      <w:bCs/>
+    </w:rPr>
+  </w:style>
+  <w:style w:type="character" w:styleId="SourceText">
+    <w:name w:val="Source Text"/>
+    <w:qFormat/>
+    <w:rPr>
+      <w:rFonts w:ascii="Liberation Mono" w:hAnsi="Liberation Mono" w:eastAsia="Liberation Mono" w:cs="Liberation Mono"/>
+    </w:rPr>
+  </w:style>
+  <w:style w:type="character" w:styleId="FollowedHyperlink">
+    <w:name w:val="FollowedHyperlink"/>
+    <w:rPr>
+      <w:color w:val="800000"/>
+      <w:u w:val="single"/>
+    </w:rPr>
+  </w:style>
   <w:style w:type="paragraph" w:styleId="Heading">
     <w:name w:val="Heading"/>
     <w:basedOn w:val="Normal"/>
@@ -1058,6 +1463,23 @@
     <w:rPr>
       <w:rFonts w:ascii="arial" w:hAnsi="arial"/>
       <w:sz w:val="20"/>
+    </w:rPr>
+  </w:style>
+  <w:style w:type="paragraph" w:styleId="HorizontalLine">
+    <w:name w:val="Horizontal Line"/>
+    <w:basedOn w:val="Normal"/>
+    <w:next w:val="BodyText"/>
+    <w:qFormat/>
+    <w:pPr>
+      <w:suppressLineNumbers/>
+      <w:pBdr>
+        <w:bottom w:val="double" w:sz="2" w:space="0" w:color="808080"/>
+      </w:pBdr>
+      <w:spacing w:before="0" w:after="283"/>
+    </w:pPr>
+    <w:rPr>
+      <w:sz w:val="12"/>
+      <w:szCs w:val="12"/>
     </w:rPr>
   </w:style>
   <w:style w:type="numbering" w:styleId="NoList" w:default="1">

</xml_diff>